<commit_message>
docs: complete final evidence package
</commit_message>
<xml_diff>
--- a/Reporte Final Proyecto Ingeniería de Software.docx
+++ b/Reporte Final Proyecto Ingeniería de Software.docx
@@ -15729,10 +15729,7 @@
         </w:rPr>
       </w:pPr>
       <w:r>
-        <w:rPr>
-          <w:lang w:val="es-MX"/>
-        </w:rPr>
-        <w:t>Las evidencias técnicas disponibles se integraron en este documento y en la carpeta evidencias/. Las únicas capturas no integradas requieren una sesión autenticada de GitHub o SonarQube, o una interacción manual de Swagger; sus pasos exactos se documentan en CAPTURAS_PENDIENTES.md.</w:t>
+        <w:t>Las evidencias técnicas se integraron en este documento y se conservan en la carpeta evidencias/. Se incluyen las capturas de GitHub Actions, Swagger con respuesta 403 y las métricas exportadas de SonarQube, junto con los reportes de Pytest y OWASP ZAP. Los archivos de respaldo se mantienen en el repositorio y en el paquete de entrega.</w:t>
       </w:r>
     </w:p>
     <w:tbl>

</xml_diff>